<commit_message>
Complete steam and condensate sizing engine with hydraulic validation
</commit_message>
<xml_diff>
--- a/docs/Assumptions.docx
+++ b/docs/Assumptions.docx
@@ -98,6 +98,141 @@
           <w:ilvl w:val="0"/>
           <w:numId w:val="1"/>
         </w:numPr>
+      </w:pPr>
+      <w:r>
+        <w:t>Allowable max steam velocity = 25 m/s</w:t>
+      </w:r>
+      <w:r>
+        <w:t xml:space="preserve"> (</w:t>
+      </w:r>
+      <w:r>
+        <w:t>DEFAULT_ALLOWABLE_STEAM_VELOCITY = 25.0  # m/s</w:t>
+      </w:r>
+      <w:r>
+        <w:t>)</w:t>
+      </w:r>
+    </w:p>
+    <w:p>
+      <w:pPr>
+        <w:pStyle w:val="ListParagraph"/>
+        <w:numPr>
+          <w:ilvl w:val="0"/>
+          <w:numId w:val="1"/>
+        </w:numPr>
+      </w:pPr>
+      <w:r>
+        <w:t>Pipe schedule by default will be Sch 40.</w:t>
+      </w:r>
+    </w:p>
+    <w:p>
+      <w:pPr>
+        <w:pStyle w:val="ListParagraph"/>
+        <w:numPr>
+          <w:ilvl w:val="0"/>
+          <w:numId w:val="1"/>
+        </w:numPr>
+      </w:pPr>
+      <w:r>
+        <w:t>Steam Quantity unit is kg/hr</w:t>
+      </w:r>
+    </w:p>
+    <w:p>
+      <w:pPr>
+        <w:pStyle w:val="ListParagraph"/>
+        <w:numPr>
+          <w:ilvl w:val="0"/>
+          <w:numId w:val="1"/>
+        </w:numPr>
+      </w:pPr>
+      <w:r>
+        <w:t>Mass flow unit is kg/s</w:t>
+      </w:r>
+    </w:p>
+    <w:p>
+      <w:pPr>
+        <w:pStyle w:val="ListParagraph"/>
+        <w:numPr>
+          <w:ilvl w:val="0"/>
+          <w:numId w:val="1"/>
+        </w:numPr>
+      </w:pPr>
+      <w:r>
+        <w:t>Specific volume is m3/kg</w:t>
+      </w:r>
+    </w:p>
+    <w:p>
+      <w:pPr>
+        <w:pStyle w:val="ListParagraph"/>
+        <w:numPr>
+          <w:ilvl w:val="0"/>
+          <w:numId w:val="1"/>
+        </w:numPr>
+      </w:pPr>
+      <w:r>
+        <w:t>Volumetric flow is m3/s</w:t>
+      </w:r>
+    </w:p>
+    <w:p>
+      <w:pPr>
+        <w:pStyle w:val="ListParagraph"/>
+        <w:numPr>
+          <w:ilvl w:val="0"/>
+          <w:numId w:val="1"/>
+        </w:numPr>
+      </w:pPr>
+      <w:r>
+        <w:t>For Friction factor calculation we have used Swamee-Jain equation</w:t>
+      </w:r>
+    </w:p>
+    <w:p>
+      <w:pPr>
+        <w:pStyle w:val="ListParagraph"/>
+        <w:numPr>
+          <w:ilvl w:val="0"/>
+          <w:numId w:val="1"/>
+        </w:numPr>
+      </w:pPr>
+      <w:r>
+        <w:drawing>
+          <wp:inline distT="0" distB="0" distL="0" distR="0" wp14:anchorId="696A30E8" wp14:editId="29E31DA2">
+            <wp:extent cx="3734124" cy="1204064"/>
+            <wp:effectExtent l="0" t="0" r="0" b="0"/>
+            <wp:docPr id="258172454" name="Picture 1"/>
+            <wp:cNvGraphicFramePr>
+              <a:graphicFrameLocks xmlns:a="http://schemas.openxmlformats.org/drawingml/2006/main" noChangeAspect="1"/>
+            </wp:cNvGraphicFramePr>
+            <a:graphic xmlns:a="http://schemas.openxmlformats.org/drawingml/2006/main">
+              <a:graphicData uri="http://schemas.openxmlformats.org/drawingml/2006/picture">
+                <pic:pic xmlns:pic="http://schemas.openxmlformats.org/drawingml/2006/picture">
+                  <pic:nvPicPr>
+                    <pic:cNvPr id="258172454" name=""/>
+                    <pic:cNvPicPr/>
+                  </pic:nvPicPr>
+                  <pic:blipFill>
+                    <a:blip r:embed="rId5"/>
+                    <a:stretch>
+                      <a:fillRect/>
+                    </a:stretch>
+                  </pic:blipFill>
+                  <pic:spPr>
+                    <a:xfrm>
+                      <a:off x="0" y="0"/>
+                      <a:ext cx="3734124" cy="1204064"/>
+                    </a:xfrm>
+                    <a:prstGeom prst="rect">
+                      <a:avLst/>
+                    </a:prstGeom>
+                  </pic:spPr>
+                </pic:pic>
+              </a:graphicData>
+            </a:graphic>
+          </wp:inline>
+        </w:drawing>
+      </w:r>
+    </w:p>
+    <w:p>
+      <w:pPr>
+        <w:pStyle w:val="ListParagraph"/>
       </w:pPr>
     </w:p>
     <w:sectPr>
@@ -1124,6 +1259,36 @@
       <w:spacing w:val="5"/>
     </w:rPr>
   </w:style>
+  <w:style w:type="paragraph" w:styleId="HTMLPreformatted">
+    <w:name w:val="HTML Preformatted"/>
+    <w:basedOn w:val="Normal"/>
+    <w:link w:val="HTMLPreformattedChar"/>
+    <w:uiPriority w:val="99"/>
+    <w:semiHidden/>
+    <w:unhideWhenUsed/>
+    <w:rsid w:val="007C66E3"/>
+    <w:pPr>
+      <w:spacing w:after="0" w:line="240" w:lineRule="auto"/>
+    </w:pPr>
+    <w:rPr>
+      <w:rFonts w:ascii="Consolas" w:hAnsi="Consolas"/>
+      <w:sz w:val="20"/>
+      <w:szCs w:val="20"/>
+    </w:rPr>
+  </w:style>
+  <w:style w:type="character" w:customStyle="1" w:styleId="HTMLPreformattedChar">
+    <w:name w:val="HTML Preformatted Char"/>
+    <w:basedOn w:val="DefaultParagraphFont"/>
+    <w:link w:val="HTMLPreformatted"/>
+    <w:uiPriority w:val="99"/>
+    <w:semiHidden/>
+    <w:rsid w:val="007C66E3"/>
+    <w:rPr>
+      <w:rFonts w:ascii="Consolas" w:hAnsi="Consolas"/>
+      <w:sz w:val="20"/>
+      <w:szCs w:val="20"/>
+    </w:rPr>
+  </w:style>
 </w:styles>
 </file>
 

</xml_diff>